<commit_message>
Started writing D2 page
</commit_message>
<xml_diff>
--- a/Jake CV.docx
+++ b/Jake CV.docx
@@ -26,7 +26,7 @@
         </w:rPr>
         <w:t xml:space="preserve">Jake Hood</w:t>
         <w:br w:type="textWrapping"/>
-        <w:t xml:space="preserve">Programmer/Technical Designer</w:t>
+        <w:t xml:space="preserve">Graduate Programmer/Technical Designer</w:t>
       </w:r>
       <w:r>
         <w:rPr>
@@ -468,7 +468,7 @@
           <w:szCs w:val="24"/>
           <w:rtl w:val="0"/>
         </w:rPr>
-        <w:t xml:space="preserve">Employment</w:t>
+        <w:t xml:space="preserve">Industry Employment</w:t>
       </w:r>
     </w:p>
     <w:p>
@@ -512,51 +512,7 @@
           <w:szCs w:val="24"/>
           <w:rtl w:val="0"/>
         </w:rPr>
-        <w:t xml:space="preserve">Costa Barista - Coffee making, serving customers, cleaning &amp; stock replenishment</w:t>
-      </w:r>
-    </w:p>
-    <w:p>
-      <w:pPr>
-        <w:widowControl w:val="0"/>
-        <w:spacing w:after="0" w:line="240" w:lineRule="auto"/>
-        <w:rPr>
-          <w:rFonts w:ascii="Arial" w:cs="Arial" w:eastAsia="Arial" w:hAnsi="Arial"/>
-          <w:color w:val="1a1a1a"/>
-          <w:sz w:val="24"/>
-          <w:szCs w:val="24"/>
-        </w:rPr>
-      </w:pPr>
-      <w:r>
-        <w:rPr>
-          <w:rFonts w:ascii="Arial" w:cs="Arial" w:eastAsia="Arial" w:hAnsi="Arial"/>
-          <w:color w:val="1a1a1a"/>
-          <w:sz w:val="24"/>
-          <w:szCs w:val="24"/>
-          <w:rtl w:val="0"/>
-        </w:rPr>
-        <w:t xml:space="preserve">Next The Mall Storeroom assistance Summer 2023</w:t>
-      </w:r>
-    </w:p>
-    <w:p>
-      <w:pPr>
-        <w:widowControl w:val="0"/>
-        <w:spacing w:after="0" w:line="240" w:lineRule="auto"/>
-        <w:rPr>
-          <w:rFonts w:ascii="Arial" w:cs="Arial" w:eastAsia="Arial" w:hAnsi="Arial"/>
-          <w:color w:val="1a1a1a"/>
-          <w:sz w:val="24"/>
-          <w:szCs w:val="24"/>
-        </w:rPr>
-      </w:pPr>
-      <w:r>
-        <w:rPr>
-          <w:rFonts w:ascii="Arial" w:cs="Arial" w:eastAsia="Arial" w:hAnsi="Arial"/>
-          <w:color w:val="1a1a1a"/>
-          <w:sz w:val="24"/>
-          <w:szCs w:val="24"/>
-          <w:rtl w:val="0"/>
-        </w:rPr>
-        <w:t xml:space="preserve">Currently Part Time at Tesco’s as replenishment.</w:t>
+        <w:t xml:space="preserve">Segritude Games March 2026-Present</w:t>
       </w:r>
     </w:p>
     <w:p>
@@ -574,8 +530,76 @@
       </w:pPr>
       <w:r>
         <w:rPr>
-          <w:rtl w:val="0"/>
-        </w:rPr>
+          <w:rFonts w:ascii="Arial" w:cs="Arial" w:eastAsia="Arial" w:hAnsi="Arial"/>
+          <w:b w:val="1"/>
+          <w:bCs w:val="1"/>
+          <w:color w:val="1a1a1a"/>
+          <w:sz w:val="28"/>
+          <w:szCs w:val="28"/>
+          <w:rtl w:val="0"/>
+        </w:rPr>
+        <w:br w:type="textWrapping"/>
+        <w:t xml:space="preserve">Skills</w:t>
+      </w:r>
+    </w:p>
+    <w:p>
+      <w:pPr>
+        <w:widowControl w:val="0"/>
+        <w:spacing w:after="0" w:line="240" w:lineRule="auto"/>
+        <w:rPr>
+          <w:rFonts w:ascii="Arial" w:cs="Arial" w:eastAsia="Arial" w:hAnsi="Arial"/>
+          <w:color w:val="1a1a1a"/>
+          <w:sz w:val="24"/>
+          <w:szCs w:val="24"/>
+        </w:rPr>
+      </w:pPr>
+      <w:r>
+        <w:rPr>
+          <w:rFonts w:ascii="Arial" w:cs="Arial" w:eastAsia="Arial" w:hAnsi="Arial"/>
+          <w:color w:val="1a1a1a"/>
+          <w:sz w:val="24"/>
+          <w:szCs w:val="24"/>
+          <w:rtl w:val="0"/>
+        </w:rPr>
+        <w:t xml:space="preserve">Good at communicating in group projects either as leader or as junior.</w:t>
+      </w:r>
+    </w:p>
+    <w:p>
+      <w:pPr>
+        <w:widowControl w:val="0"/>
+        <w:spacing w:after="0" w:line="240" w:lineRule="auto"/>
+        <w:rPr>
+          <w:rFonts w:ascii="Arial" w:cs="Arial" w:eastAsia="Arial" w:hAnsi="Arial"/>
+          <w:b w:val="1"/>
+          <w:bCs w:val="1"/>
+          <w:color w:val="1a1a1a"/>
+          <w:sz w:val="28"/>
+          <w:szCs w:val="28"/>
+        </w:rPr>
+      </w:pPr>
+      <w:r>
+        <w:rPr>
+          <w:rFonts w:ascii="Arial" w:cs="Arial" w:eastAsia="Arial" w:hAnsi="Arial"/>
+          <w:color w:val="1a1a1a"/>
+          <w:sz w:val="24"/>
+          <w:szCs w:val="24"/>
+          <w:rtl w:val="0"/>
+        </w:rPr>
+        <w:t xml:space="preserve">Happy to playtest and find issues in many games then help fix them.</w:t>
+        <w:br w:type="textWrapping"/>
+        <w:t xml:space="preserve">I feel confident to come up with ideas for the games I play which makes me feel confident to do so and work on them for the games I develop.</w:t>
+      </w:r>
+      <w:r>
+        <w:rPr>
+          <w:rFonts w:ascii="Arial" w:cs="Arial" w:eastAsia="Arial" w:hAnsi="Arial"/>
+          <w:b w:val="1"/>
+          <w:bCs w:val="1"/>
+          <w:color w:val="1a1a1a"/>
+          <w:sz w:val="28"/>
+          <w:szCs w:val="28"/>
+          <w:rtl w:val="0"/>
+        </w:rPr>
+        <w:br w:type="textWrapping"/>
       </w:r>
     </w:p>
     <w:p>
@@ -625,7 +649,7 @@
           <w:szCs w:val="24"/>
           <w:rtl w:val="0"/>
         </w:rPr>
-        <w:t xml:space="preserve">Gaming, Content Creation, Paintball/Airsoft, Go-Karting, Esports and Partnered with YouTube</w:t>
+        <w:t xml:space="preserve">I enjoy gaming in my free time, not just as a job. I have fun doing content creation on the games I play either helping to teach people about a game or talking about ways to help improve the game to get community feedback on ideas to help them be heard. Outside of gaming I enjoy going Paintball/Airsoft and Go-Karting with some friends.</w:t>
         <w:br w:type="textWrapping"/>
         <w:br w:type="textWrapping"/>
       </w:r>

</xml_diff>